<commit_message>
Séance 2 : colonne Éducation/Animation complétée, « A finaliser… » retiré
Co-Authored-By: Claude Opus 5.5 <noreply@anthropic.com>
Claude-Session: https://claude.ai/code/session_01XAHzSeLz34VQeMX1PwfzZj
</commit_message>
<xml_diff>
--- a/Dossier_groupe2/Dossier_GEPP_Mont-Riviere_groupe2.docx
+++ b/Dossier_groupe2/Dossier_GEPP_Mont-Riviere_groupe2.docx
@@ -635,11 +635,11 @@
         </w:tblBorders>
       </w:tblPr>
       <w:tblGrid>
-        <w:gridCol w:w="1080"/>
+        <w:gridCol w:w="950"/>
         <w:gridCol w:w="2100"/>
-        <w:gridCol w:w="1700"/>
-        <w:gridCol w:w="1900"/>
-        <w:gridCol w:w="2246"/>
+        <w:gridCol w:w="2000"/>
+        <w:gridCol w:w="1830"/>
+        <w:gridCol w:w="2146"/>
       </w:tblGrid>
       <w:tr>
         <w:trPr>
@@ -647,7 +647,7 @@
         </w:trPr>
         <w:tc>
           <w:tcPr>
-            <w:tcW w:type="dxa" w:w="1080"/>
+            <w:tcW w:type="dxa" w:w="950"/>
             <w:tcBorders>
               <w:top w:val="single" w:color="000000" w:sz="8"/>
               <w:left w:val="single" w:color="000000" w:sz="8"/>
@@ -701,7 +701,7 @@
         </w:tc>
         <w:tc>
           <w:tcPr>
-            <w:tcW w:type="dxa" w:w="1700"/>
+            <w:tcW w:type="dxa" w:w="2000"/>
             <w:tcBorders>
               <w:top w:val="single" w:color="000000" w:sz="8"/>
               <w:left w:val="single" w:color="000000" w:sz="8"/>
@@ -728,7 +728,7 @@
         </w:tc>
         <w:tc>
           <w:tcPr>
-            <w:tcW w:type="dxa" w:w="1900"/>
+            <w:tcW w:type="dxa" w:w="1830"/>
             <w:tcBorders>
               <w:top w:val="single" w:color="000000" w:sz="8"/>
               <w:left w:val="single" w:color="000000" w:sz="8"/>
@@ -755,7 +755,7 @@
         </w:tc>
         <w:tc>
           <w:tcPr>
-            <w:tcW w:type="dxa" w:w="2246"/>
+            <w:tcW w:type="dxa" w:w="2146"/>
             <w:tcBorders>
               <w:top w:val="single" w:color="000000" w:sz="8"/>
               <w:left w:val="single" w:color="000000" w:sz="8"/>
@@ -787,7 +787,7 @@
         </w:trPr>
         <w:tc>
           <w:tcPr>
-            <w:tcW w:type="dxa" w:w="1080"/>
+            <w:tcW w:type="dxa" w:w="950"/>
             <w:tcBorders>
               <w:top w:val="single" w:color="000000" w:sz="8"/>
               <w:left w:val="single" w:color="000000" w:sz="8"/>
@@ -957,7 +957,7 @@
         </w:tc>
         <w:tc>
           <w:tcPr>
-            <w:tcW w:type="dxa" w:w="1700"/>
+            <w:tcW w:type="dxa" w:w="2000"/>
             <w:tcBorders>
               <w:top w:val="single" w:color="000000" w:sz="8"/>
               <w:left w:val="single" w:color="000000" w:sz="8"/>
@@ -983,11 +983,16 @@
               <w:jc w:val="left"/>
             </w:pPr>
             <w:r>
-              <w:rPr>
-                <w:sz w:val="16"/>
-                <w:szCs w:val="16"/>
-              </w:rPr>
-              <w:t xml:space="preserve">Animateurs périscolaires / Extrascolaire</w:t>
+              <w:t xml:space="preserve">Animateurs périscolaires / Extrascolaire (</w:t>
+            </w:r>
+            <w:r>
+              <w:rPr>
+                <w:color w:val="FF0000"/>
+              </w:rPr>
+              <w:t xml:space="preserve">critiques</w:t>
+            </w:r>
+            <w:r>
+              <w:t xml:space="preserve">)</w:t>
             </w:r>
           </w:p>
           <w:p>
@@ -1001,10 +1006,6 @@
               <w:jc w:val="left"/>
             </w:pPr>
             <w:r>
-              <w:rPr>
-                <w:sz w:val="16"/>
-                <w:szCs w:val="16"/>
-              </w:rPr>
               <w:t xml:space="preserve">Bibliothécaires</w:t>
             </w:r>
           </w:p>
@@ -1019,31 +1020,18 @@
               <w:jc w:val="left"/>
             </w:pPr>
             <w:r>
-              <w:rPr>
-                <w:sz w:val="16"/>
-                <w:szCs w:val="16"/>
-              </w:rPr>
-              <w:t xml:space="preserve"/>
-            </w:r>
-          </w:p>
-        </w:tc>
-        <w:tc>
-          <w:tcPr>
-            <w:tcW w:type="dxa" w:w="1900"/>
-            <w:tcBorders>
-              <w:top w:val="single" w:color="000000" w:sz="8"/>
-              <w:left w:val="single" w:color="000000" w:sz="8"/>
-              <w:bottom w:val="single" w:color="000000" w:sz="8"/>
-              <w:right w:val="single" w:color="000000" w:sz="8"/>
-            </w:tcBorders>
-            <w:tcMar>
-              <w:top w:type="dxa" w:w="80"/>
-              <w:left w:type="dxa" w:w="100"/>
-              <w:bottom w:type="dxa" w:w="80"/>
-              <w:right w:type="dxa" w:w="100"/>
-            </w:tcMar>
-            <w:vAlign w:val="top"/>
-          </w:tcPr>
+              <w:t xml:space="preserve">ATSEM et agents d’entretien des écoles (</w:t>
+            </w:r>
+            <w:r>
+              <w:rPr>
+                <w:color w:val="FF0000"/>
+              </w:rPr>
+              <w:t xml:space="preserve">coeur</w:t>
+            </w:r>
+            <w:r>
+              <w:t xml:space="preserve">)</w:t>
+            </w:r>
+          </w:p>
           <w:p>
             <w:pPr>
               <w:pStyle w:val="ListParagraph"/>
@@ -1055,18 +1043,27 @@
               <w:jc w:val="left"/>
             </w:pPr>
             <w:r>
-              <w:t xml:space="preserve">animateurs périscolaire/extrascolaire( </w:t>
-            </w:r>
-            <w:r>
-              <w:rPr>
-                <w:color w:val="FF0000"/>
-              </w:rPr>
-              <w:t xml:space="preserve">critiques</w:t>
-            </w:r>
-            <w:r>
-              <w:t xml:space="preserve">)</w:t>
-            </w:r>
-          </w:p>
+              <w:t xml:space="preserve">directeurs d’accueils de loisirs</w:t>
+            </w:r>
+          </w:p>
+        </w:tc>
+        <w:tc>
+          <w:tcPr>
+            <w:tcW w:type="dxa" w:w="1830"/>
+            <w:tcBorders>
+              <w:top w:val="single" w:color="000000" w:sz="8"/>
+              <w:left w:val="single" w:color="000000" w:sz="8"/>
+              <w:bottom w:val="single" w:color="000000" w:sz="8"/>
+              <w:right w:val="single" w:color="000000" w:sz="8"/>
+            </w:tcBorders>
+            <w:tcMar>
+              <w:top w:type="dxa" w:w="80"/>
+              <w:left w:type="dxa" w:w="100"/>
+              <w:bottom w:type="dxa" w:w="80"/>
+              <w:right w:type="dxa" w:w="100"/>
+            </w:tcMar>
+            <w:vAlign w:val="top"/>
+          </w:tcPr>
           <w:p>
             <w:pPr>
               <w:pStyle w:val="ListParagraph"/>
@@ -1078,7 +1075,7 @@
               <w:jc w:val="left"/>
             </w:pPr>
             <w:r>
-              <w:t xml:space="preserve">bibliothécaires( </w:t>
+              <w:t xml:space="preserve">animateurs périscolaire/extrascolaire( </w:t>
             </w:r>
             <w:r>
               <w:rPr>
@@ -1101,7 +1098,7 @@
               <w:jc w:val="left"/>
             </w:pPr>
             <w:r>
-              <w:t xml:space="preserve">médiateurs( </w:t>
+              <w:t xml:space="preserve">bibliothécaires( </w:t>
             </w:r>
             <w:r>
               <w:rPr>
@@ -1124,7 +1121,16 @@
               <w:jc w:val="left"/>
             </w:pPr>
             <w:r>
-              <w:t xml:space="preserve">educateur sportifs</w:t>
+              <w:t xml:space="preserve">médiateurs( </w:t>
+            </w:r>
+            <w:r>
+              <w:rPr>
+                <w:color w:val="FF0000"/>
+              </w:rPr>
+              <w:t xml:space="preserve">critiques</w:t>
+            </w:r>
+            <w:r>
+              <w:t xml:space="preserve">)</w:t>
             </w:r>
           </w:p>
           <w:p>
@@ -1138,27 +1144,9 @@
               <w:jc w:val="left"/>
             </w:pPr>
             <w:r>
-              <w:t xml:space="preserve">encadrant et responsable de services</w:t>
-            </w:r>
-          </w:p>
-        </w:tc>
-        <w:tc>
-          <w:tcPr>
-            <w:tcW w:type="dxa" w:w="2246"/>
-            <w:tcBorders>
-              <w:top w:val="single" w:color="000000" w:sz="8"/>
-              <w:left w:val="single" w:color="000000" w:sz="8"/>
-              <w:bottom w:val="single" w:color="000000" w:sz="8"/>
-              <w:right w:val="single" w:color="000000" w:sz="8"/>
-            </w:tcBorders>
-            <w:tcMar>
-              <w:top w:type="dxa" w:w="80"/>
-              <w:left w:type="dxa" w:w="100"/>
-              <w:bottom w:type="dxa" w:w="80"/>
-              <w:right w:type="dxa" w:w="100"/>
-            </w:tcMar>
-            <w:vAlign w:val="top"/>
-          </w:tcPr>
+              <w:t xml:space="preserve">educateur sportifs</w:t>
+            </w:r>
+          </w:p>
           <w:p>
             <w:pPr>
               <w:pStyle w:val="ListParagraph"/>
@@ -1170,18 +1158,27 @@
               <w:jc w:val="left"/>
             </w:pPr>
             <w:r>
-              <w:t xml:space="preserve">gestionnaire assistant rh ( </w:t>
-            </w:r>
-            <w:r>
-              <w:rPr>
-                <w:color w:val="FF0000"/>
-              </w:rPr>
-              <w:t xml:space="preserve">critiques</w:t>
-            </w:r>
-            <w:r>
-              <w:t xml:space="preserve">)</w:t>
-            </w:r>
-          </w:p>
+              <w:t xml:space="preserve">encadrant et responsable de services</w:t>
+            </w:r>
+          </w:p>
+        </w:tc>
+        <w:tc>
+          <w:tcPr>
+            <w:tcW w:type="dxa" w:w="2146"/>
+            <w:tcBorders>
+              <w:top w:val="single" w:color="000000" w:sz="8"/>
+              <w:left w:val="single" w:color="000000" w:sz="8"/>
+              <w:bottom w:val="single" w:color="000000" w:sz="8"/>
+              <w:right w:val="single" w:color="000000" w:sz="8"/>
+            </w:tcBorders>
+            <w:tcMar>
+              <w:top w:type="dxa" w:w="80"/>
+              <w:left w:type="dxa" w:w="100"/>
+              <w:bottom w:type="dxa" w:w="80"/>
+              <w:right w:type="dxa" w:w="100"/>
+            </w:tcMar>
+            <w:vAlign w:val="top"/>
+          </w:tcPr>
           <w:p>
             <w:pPr>
               <w:pStyle w:val="ListParagraph"/>
@@ -1193,7 +1190,16 @@
               <w:jc w:val="left"/>
             </w:pPr>
             <w:r>
-              <w:t xml:space="preserve">gestionnaire budgétaire / comptable</w:t>
+              <w:t xml:space="preserve">gestionnaire assistant rh ( </w:t>
+            </w:r>
+            <w:r>
+              <w:rPr>
+                <w:color w:val="FF0000"/>
+              </w:rPr>
+              <w:t xml:space="preserve">critiques</w:t>
+            </w:r>
+            <w:r>
+              <w:t xml:space="preserve">)</w:t>
             </w:r>
           </w:p>
           <w:p>
@@ -1207,7 +1213,7 @@
               <w:jc w:val="left"/>
             </w:pPr>
             <w:r>
-              <w:t xml:space="preserve">juristes</w:t>
+              <w:t xml:space="preserve">gestionnaire budgétaire / comptable</w:t>
             </w:r>
           </w:p>
           <w:p>
@@ -1221,16 +1227,7 @@
               <w:jc w:val="left"/>
             </w:pPr>
             <w:r>
-              <w:t xml:space="preserve">informaticiens ( </w:t>
-            </w:r>
-            <w:r>
-              <w:rPr>
-                <w:color w:val="FF0000"/>
-              </w:rPr>
-              <w:t xml:space="preserve">critiques</w:t>
-            </w:r>
-            <w:r>
-              <w:t xml:space="preserve">)</w:t>
+              <w:t xml:space="preserve">juristes</w:t>
             </w:r>
           </w:p>
           <w:p>
@@ -1244,7 +1241,16 @@
               <w:jc w:val="left"/>
             </w:pPr>
             <w:r>
-              <w:t xml:space="preserve">assistants administration</w:t>
+              <w:t xml:space="preserve">informaticiens ( </w:t>
+            </w:r>
+            <w:r>
+              <w:rPr>
+                <w:color w:val="FF0000"/>
+              </w:rPr>
+              <w:t xml:space="preserve">critiques</w:t>
+            </w:r>
+            <w:r>
+              <w:t xml:space="preserve">)</w:t>
             </w:r>
           </w:p>
           <w:p>
@@ -1258,6 +1264,20 @@
               <w:jc w:val="left"/>
             </w:pPr>
             <w:r>
+              <w:t xml:space="preserve">assistants administration</w:t>
+            </w:r>
+          </w:p>
+          <w:p>
+            <w:pPr>
+              <w:pStyle w:val="ListParagraph"/>
+              <w:numPr>
+                <w:ilvl w:val="0"/>
+                <w:numId w:val="3"/>
+              </w:numPr>
+              <w:spacing w:after="0" w:before="0" w:line="276" w:lineRule="auto"/>
+              <w:jc w:val="left"/>
+            </w:pPr>
+            <w:r>
               <w:t xml:space="preserve">chef de projet ( </w:t>
             </w:r>
             <w:r>
@@ -1273,24 +1293,6 @@
         </w:tc>
       </w:tr>
     </w:tbl>
-    <w:p>
-      <w:pPr>
-        <w:spacing w:after="0" w:before="0" w:line="276" w:lineRule="auto"/>
-        <w:jc w:val="left"/>
-      </w:pPr>
-      <w:r>
-        <w:t xml:space="preserve"/>
-      </w:r>
-    </w:p>
-    <w:p>
-      <w:pPr>
-        <w:spacing w:after="0" w:before="0" w:line="276" w:lineRule="auto"/>
-        <w:jc w:val="left"/>
-      </w:pPr>
-      <w:r>
-        <w:t xml:space="preserve">A finaliser…</w:t>
-      </w:r>
-    </w:p>
     <w:p>
       <w:pPr>
         <w:spacing w:after="0" w:before="0" w:line="276" w:lineRule="auto"/>

</xml_diff>